<commit_message>
Pagos: buscador de estudiantes por legajo o nombre
El selector de estudiantes pasa a ser un combo editable con autocompletado
(sin tildes, cualquier orden de palabras) para cuando haya muchos. Si se
edita el texto después de elegir, la selección se descarta.

Co-Authored-By: Claude Sonnet 5.5 <noreply@anthropic.com>
</commit_message>
<xml_diff>
--- a/docs/Informe_Tecnico.docx
+++ b/docs/Informe_Tecnico.docx
@@ -779,7 +779,7 @@
                 <w:b/>
                 <w:bCs/>
               </w:rPr>
-              <w:t xml:space="preserve">78 pruebas JUnit 5</w:t>
+              <w:t xml:space="preserve">91 pruebas JUnit 5</w:t>
             </w:r>
             <w:r>
               <w:t xml:space="preserve">: Logger, Factory, cálculo de saldos y servicio JPA sobre H2.</w:t>
@@ -1224,7 +1224,7 @@
         <w:t xml:space="preserve">toasts</w:t>
       </w:r>
       <w:r>
-        <w:t xml:space="preserve"> no bloqueantes en lugar de diálogos, y los campos con error se sacuden. La conexión se abre en un </w:t>
+        <w:t xml:space="preserve"> no bloqueantes en lugar de diálogos, y los campos con error se sacuden. El selector de estudiantes es un buscador con autocompletado (legajo o nombre, sin tildes), pensado para cuando haya muchos. La conexión se abre en un </w:t>
       </w:r>
       <w:r>
         <w:rPr>
@@ -1236,7 +1236,7 @@
         <w:t xml:space="preserve">Task</w:t>
       </w:r>
       <w:r>
-        <w:t xml:space="preserve"> para no congelar la ventana.</w:t>
+        <w:t xml:space="preserve">.</w:t>
       </w:r>
     </w:p>
     <w:p>
@@ -2041,7 +2041,7 @@
           <w:b/>
           <w:bCs/>
         </w:rPr>
-        <w:t xml:space="preserve">78 pruebas, 0 fallas</w:t>
+        <w:t xml:space="preserve">91 pruebas, 0 fallas</w:t>
       </w:r>
       <w:r>
         <w:t xml:space="preserve">. </w:t>
@@ -2092,7 +2092,19 @@
         <w:t xml:space="preserve">PagoServiceTest</w:t>
       </w:r>
       <w:r>
-        <w:t xml:space="preserve"> (JPA + H2: duplicados, montos, becas, acreditación, JPQL).</w:t>
+        <w:t xml:space="preserve"> (JPA + H2: duplicados, montos, becas, acreditación, JPQL) y </w:t>
+      </w:r>
+      <w:r>
+        <w:rPr>
+          <w:sz w:val="17"/>
+          <w:szCs w:val="17"/>
+          <w:rFonts w:ascii="Consolas" w:cs="Consolas" w:eastAsia="Consolas" w:hAnsi="Consolas"/>
+          <w:shd w:fill="F1EFEA" w:color="auto" w:val="clear"/>
+        </w:rPr>
+        <w:t xml:space="preserve">BusquedaTest</w:t>
+      </w:r>
+      <w:r>
+        <w:t xml:space="preserve"> (búsqueda de estudiantes).</w:t>
       </w:r>
     </w:p>
     <w:p>
@@ -2230,7 +2242,7 @@
         </w:rPr>
         <w:t xml:space="preserve">  </w:t>
       </w:r>
-      <w:hyperlink w:history="1" r:id="rIdxgfgwd3birs2jqpvq_c3i">
+      <w:hyperlink w:history="1" r:id="rId4ud7uf5r7gh7c2yivwo2o">
         <w:r>
           <w:rPr>
             <w:b/>

</xml_diff>